<commit_message>
docs: Update standalone cover page designs
This commit syncs the manual updates to the standalone Microsoft Word and PDF cover files.
</commit_message>
<xml_diff>
--- a/docs/graduation-book/CareerCompass_Cover.docx
+++ b/docs/graduation-book/CareerCompass_Cover.docx
@@ -35,7 +35,7 @@
                 <w:noProof/>
               </w:rPr>
               <w:drawing>
-                <wp:inline distT="0" distB="0" distL="0" distR="0" wp14:anchorId="1A4A50A8" wp14:editId="30050E7B">
+                <wp:inline distT="0" distB="0" distL="0" distR="0" wp14:anchorId="1EBE2C94" wp14:editId="00C0E0FE">
                   <wp:extent cx="1143000" cy="1295400"/>
                   <wp:effectExtent l="0" t="0" r="0" b="0"/>
                   <wp:docPr id="1" name="Picture 1"/>
@@ -86,7 +86,7 @@
                 <w:noProof/>
               </w:rPr>
               <w:drawing>
-                <wp:inline distT="0" distB="0" distL="0" distR="0" wp14:anchorId="4D09492B" wp14:editId="7848D135">
+                <wp:inline distT="0" distB="0" distL="0" distR="0" wp14:anchorId="02841EBC" wp14:editId="219BB717">
                   <wp:extent cx="1143000" cy="1143000"/>
                   <wp:effectExtent l="0" t="0" r="0" b="0"/>
                   <wp:docPr id="2" name="Picture 2"/>
@@ -125,15 +125,6 @@
         </w:tc>
       </w:tr>
     </w:tbl>
-    <w:p>
-      <w:pPr>
-        <w:rPr>
-          <w:rFonts w:ascii="Calibri" w:hAnsi="Calibri"/>
-          <w:b/>
-          <w:sz w:val="32"/>
-        </w:rPr>
-      </w:pPr>
-    </w:p>
     <w:p>
       <w:pPr>
         <w:jc w:val="center"/>
@@ -188,10 +179,6 @@
     <w:p>
       <w:pPr>
         <w:jc w:val="center"/>
-        <w:rPr>
-          <w:rFonts w:ascii="Calibri" w:hAnsi="Calibri"/>
-          <w:sz w:val="26"/>
-        </w:rPr>
       </w:pPr>
       <w:r>
         <w:rPr>
@@ -201,24 +188,20 @@
         <w:t>2025 / 2026</w:t>
       </w:r>
     </w:p>
+    <w:p/>
     <w:p>
       <w:pPr>
         <w:jc w:val="center"/>
-        <w:rPr>
-          <w:rFonts w:hint="cs"/>
-          <w:rtl/>
-          <w:lang w:bidi="ar-EG"/>
-        </w:rPr>
       </w:pPr>
       <w:r>
         <w:rPr>
           <w:noProof/>
         </w:rPr>
         <w:drawing>
-          <wp:inline distT="0" distB="0" distL="0" distR="0" wp14:anchorId="1C8ECF40" wp14:editId="59535CAF">
-            <wp:extent cx="1260000" cy="1260000"/>
+          <wp:inline distT="0" distB="0" distL="0" distR="0" wp14:anchorId="6DCBB372" wp14:editId="3AB015E9">
+            <wp:extent cx="1261872" cy="1272684"/>
             <wp:effectExtent l="0" t="0" r="0" b="0"/>
-            <wp:docPr id="949656331" name="Picture 2"/>
+            <wp:docPr id="3" name="Picture 3"/>
             <wp:cNvGraphicFramePr>
               <a:graphicFrameLocks xmlns:a="http://schemas.openxmlformats.org/drawingml/2006/main" noChangeAspect="1"/>
             </wp:cNvGraphicFramePr>
@@ -226,36 +209,23 @@
               <a:graphicData uri="http://schemas.openxmlformats.org/drawingml/2006/picture">
                 <pic:pic xmlns:pic="http://schemas.openxmlformats.org/drawingml/2006/picture">
                   <pic:nvPicPr>
-                    <pic:cNvPr id="0" name="Picture 6"/>
-                    <pic:cNvPicPr>
-                      <a:picLocks noChangeAspect="1" noChangeArrowheads="1"/>
-                    </pic:cNvPicPr>
+                    <pic:cNvPr id="0" name="CC_Logo.png"/>
+                    <pic:cNvPicPr/>
                   </pic:nvPicPr>
                   <pic:blipFill>
-                    <a:blip r:embed="rId6" cstate="print">
-                      <a:extLst>
-                        <a:ext uri="{28A0092B-C50C-407E-A947-70E740481C1C}">
-                          <a14:useLocalDpi xmlns:a14="http://schemas.microsoft.com/office/drawing/2010/main" val="0"/>
-                        </a:ext>
-                      </a:extLst>
-                    </a:blip>
-                    <a:srcRect/>
+                    <a:blip r:embed="rId6"/>
                     <a:stretch>
                       <a:fillRect/>
                     </a:stretch>
                   </pic:blipFill>
-                  <pic:spPr bwMode="auto">
+                  <pic:spPr>
                     <a:xfrm>
                       <a:off x="0" y="0"/>
-                      <a:ext cx="1260000" cy="1260000"/>
+                      <a:ext cx="1261872" cy="1272684"/>
                     </a:xfrm>
                     <a:prstGeom prst="rect">
                       <a:avLst/>
                     </a:prstGeom>
-                    <a:noFill/>
-                    <a:ln>
-                      <a:noFill/>
-                    </a:ln>
                   </pic:spPr>
                 </pic:pic>
               </a:graphicData>
@@ -267,12 +237,6 @@
     <w:p>
       <w:pPr>
         <w:jc w:val="center"/>
-        <w:rPr>
-          <w:rFonts w:ascii="Calibri" w:hAnsi="Calibri"/>
-          <w:b/>
-          <w:color w:val="0F172A"/>
-          <w:sz w:val="44"/>
-        </w:rPr>
       </w:pPr>
       <w:proofErr w:type="spellStart"/>
       <w:r>
@@ -289,29 +253,17 @@
     <w:p>
       <w:pPr>
         <w:jc w:val="center"/>
-        <w:rPr>
-          <w:rFonts w:ascii="Calibri" w:hAnsi="Calibri"/>
-          <w:b/>
-          <w:color w:val="0F172A"/>
-          <w:sz w:val="44"/>
-          <w:rtl/>
-        </w:rPr>
       </w:pPr>
       <w:r>
         <w:rPr>
           <w:rFonts w:ascii="Calibri" w:hAnsi="Calibri"/>
-          <w:b/>
-          <w:color w:val="0F172A"/>
-          <w:sz w:val="44"/>
+          <w:color w:val="334155"/>
+          <w:sz w:val="28"/>
         </w:rPr>
         <w:t>AI-Powered Career Guidance and Job Recommendation Platform</w:t>
       </w:r>
     </w:p>
-    <w:p>
-      <w:pPr>
-        <w:jc w:val="center"/>
-      </w:pPr>
-    </w:p>
+    <w:p/>
     <w:p>
       <w:pPr>
         <w:jc w:val="center"/>
@@ -490,7 +442,6 @@
         <w:t>Dr. Amena Mahmoud</w:t>
       </w:r>
     </w:p>
-    <w:p/>
     <w:sectPr>
       <w:pgSz w:w="12240" w:h="15840"/>
       <w:pgMar w:top="426" w:right="1440" w:bottom="142" w:left="1440" w:header="720" w:footer="720" w:gutter="0"/>

</xml_diff>